<commit_message>
Enhances legal document generation and storage
Adds R2 storage key to document results and signed URL retrieval with bucket support.

Modifies contract generation to utilize R2 keys for document links. Introduces a function to retrieve signed URLs for files stored in R2, where the bucket name is part of the key. Updates document generation to handle cases where document links are R2 keys.

Also, renames some blueprint templates for clarity and consistency.
</commit_message>
<xml_diff>
--- a/apps/legal-docs-blueprints/templates/carta_aceptacion_gps/carta_aceptacion_gps-mujer-plural.docx
+++ b/apps/legal-docs-blueprints/templates/carta_aceptacion_gps/carta_aceptacion_gps-mujer-plural.docx
@@ -133,10 +133,10 @@
           <w:szCs w:val="20"/>
         </w:rPr>
       </w:r>
-      <w:bookmarkStart w:id="4" w:name="_heading=h.9r9854fl2myx"/>
-      <w:bookmarkStart w:id="5" w:name="_heading=h.ath3c5fabs5a"/>
-      <w:bookmarkStart w:id="6" w:name="_heading=h.9r9854fl2myx"/>
-      <w:bookmarkStart w:id="7" w:name="_heading=h.ath3c5fabs5a"/>
+      <w:bookmarkStart w:id="4" w:name="_heading=h.ath3c5fabs5a"/>
+      <w:bookmarkStart w:id="5" w:name="_heading=h.9r9854fl2myx"/>
+      <w:bookmarkStart w:id="6" w:name="_heading=h.ath3c5fabs5a"/>
+      <w:bookmarkStart w:id="7" w:name="_heading=h.9r9854fl2myx"/>
       <w:bookmarkEnd w:id="6"/>
       <w:bookmarkEnd w:id="7"/>
     </w:p>
@@ -446,7 +446,79 @@
           <w:sz w:val="20"/>
           <w:szCs w:val="20"/>
         </w:rPr>
-        <w:t xml:space="preserve">manifiesto que estoy enterada y acepto expresamente que el vehículo con las siguientes descripciones: </w:t>
+        <w:t>manif</w:t>
+      </w:r>
+      <w:r>
+        <w:rPr>
+          <w:rFonts w:eastAsia="Arial" w:cs="Arial" w:ascii="Arial" w:hAnsi="Arial"/>
+          <w:color w:val="000000"/>
+          <w:sz w:val="20"/>
+          <w:szCs w:val="20"/>
+        </w:rPr>
+        <w:t>estamos</w:t>
+      </w:r>
+      <w:r>
+        <w:rPr>
+          <w:rFonts w:eastAsia="Arial" w:cs="Arial" w:ascii="Arial" w:hAnsi="Arial"/>
+          <w:color w:val="000000"/>
+          <w:sz w:val="20"/>
+          <w:szCs w:val="20"/>
+        </w:rPr>
+        <w:t xml:space="preserve"> que est</w:t>
+      </w:r>
+      <w:r>
+        <w:rPr>
+          <w:rFonts w:eastAsia="Arial" w:cs="Arial" w:ascii="Arial" w:hAnsi="Arial"/>
+          <w:color w:val="000000"/>
+          <w:sz w:val="20"/>
+          <w:szCs w:val="20"/>
+        </w:rPr>
+        <w:t>amos</w:t>
+      </w:r>
+      <w:r>
+        <w:rPr>
+          <w:rFonts w:eastAsia="Arial" w:cs="Arial" w:ascii="Arial" w:hAnsi="Arial"/>
+          <w:color w:val="000000"/>
+          <w:sz w:val="20"/>
+          <w:szCs w:val="20"/>
+        </w:rPr>
+        <w:t xml:space="preserve"> enterada</w:t>
+      </w:r>
+      <w:r>
+        <w:rPr>
+          <w:rFonts w:eastAsia="Arial" w:cs="Arial" w:ascii="Arial" w:hAnsi="Arial"/>
+          <w:color w:val="000000"/>
+          <w:sz w:val="20"/>
+          <w:szCs w:val="20"/>
+        </w:rPr>
+        <w:t>s</w:t>
+      </w:r>
+      <w:r>
+        <w:rPr>
+          <w:rFonts w:eastAsia="Arial" w:cs="Arial" w:ascii="Arial" w:hAnsi="Arial"/>
+          <w:color w:val="000000"/>
+          <w:sz w:val="20"/>
+          <w:szCs w:val="20"/>
+        </w:rPr>
+        <w:t xml:space="preserve"> y acept</w:t>
+      </w:r>
+      <w:r>
+        <w:rPr>
+          <w:rFonts w:eastAsia="Arial" w:cs="Arial" w:ascii="Arial" w:hAnsi="Arial"/>
+          <w:color w:val="000000"/>
+          <w:sz w:val="20"/>
+          <w:szCs w:val="20"/>
+        </w:rPr>
+        <w:t>amos</w:t>
+      </w:r>
+      <w:r>
+        <w:rPr>
+          <w:rFonts w:eastAsia="Arial" w:cs="Arial" w:ascii="Arial" w:hAnsi="Arial"/>
+          <w:color w:val="000000"/>
+          <w:sz w:val="20"/>
+          <w:szCs w:val="20"/>
+        </w:rPr>
+        <w:t xml:space="preserve"> expresamente que el vehículo con las siguientes descripciones: </w:t>
       </w:r>
       <w:r>
         <w:rPr>
@@ -1110,7 +1182,14 @@
                 <w:rFonts w:ascii="Arial" w:hAnsi="Arial"/>
                 <w:sz w:val="20"/>
               </w:rPr>
-              <w:t>F)________________________</w:t>
+              <w:t>f</w:t>
+            </w:r>
+            <w:r>
+              <w:rPr>
+                <w:rFonts w:ascii="Arial" w:hAnsi="Arial"/>
+                <w:sz w:val="20"/>
+              </w:rPr>
+              <w:t>)________________________</w:t>
             </w:r>
           </w:p>
           <w:p>
@@ -1188,7 +1267,14 @@
                 <w:rFonts w:ascii="Arial" w:hAnsi="Arial"/>
                 <w:sz w:val="20"/>
               </w:rPr>
-              <w:t>F)________________________</w:t>
+              <w:t>f</w:t>
+            </w:r>
+            <w:r>
+              <w:rPr>
+                <w:rFonts w:ascii="Arial" w:hAnsi="Arial"/>
+                <w:sz w:val="20"/>
+              </w:rPr>
+              <w:t>)________________________</w:t>
             </w:r>
           </w:p>
           <w:p>

</xml_diff>